<commit_message>
chore: update question answers test files
</commit_message>
<xml_diff>
--- a/tests/fixtures/baza/odgovori/ndo/1.docx
+++ b/tests/fixtures/baza/odgovori/ndo/1.docx
@@ -53,7 +53,7 @@
           <w:rStyle w:val="PonueniodgovoriChar"/>
           <w:lang w:val="sr-Latn-BA"/>
         </w:rPr>
-        <w:t xml:space="preserve"> – odgovor</w:t>
+        <w:t xml:space="preserve"> - odgovor</w:t>
       </w:r>
       <w:bookmarkStart w:id="0" w:name="_GoBack"/>
       <w:bookmarkEnd w:id="0"/>
@@ -2143,23 +2143,6 @@
 </file>
 
 <file path=customXml/item1.xml><?xml version="1.0" encoding="utf-8"?>
-<?mso-contentType ?>
-<FormTemplates xmlns="http://schemas.microsoft.com/sharepoint/v3/contenttype/forms">
-  <Display>DocumentLibraryForm</Display>
-  <Edit>DocumentLibraryForm</Edit>
-  <New>DocumentLibraryForm</New>
-</FormTemplates>
-</file>
-
-<file path=customXml/item2.xml><?xml version="1.0" encoding="utf-8"?>
-<p:properties xmlns:p="http://schemas.microsoft.com/office/2006/metadata/properties" xmlns:xsi="http://www.w3.org/2001/XMLSchema-instance" xmlns:pc="http://schemas.microsoft.com/office/infopath/2007/PartnerControls">
-  <documentManagement>
-    <_activity xmlns="b33a16b6-9e89-4ffa-be05-0158ba67738c" xsi:nil="true"/>
-  </documentManagement>
-</p:properties>
-</file>
-
-<file path=customXml/item3.xml><?xml version="1.0" encoding="utf-8"?>
 <ct:contentTypeSchema xmlns:ct="http://schemas.microsoft.com/office/2006/metadata/contentType" xmlns:ma="http://schemas.microsoft.com/office/2006/metadata/properties/metaAttributes" ct:_="" ma:_="" ma:contentTypeName="Document" ma:contentTypeID="0x010100495CB42C615A6E4DA101D8348ECDACB8" ma:contentTypeVersion="11" ma:contentTypeDescription="Create a new document." ma:contentTypeScope="" ma:versionID="8adfb428dd80d5bb3c52b769f3bfa108">
   <xsd:schema xmlns:xsd="http://www.w3.org/2001/XMLSchema" xmlns:xs="http://www.w3.org/2001/XMLSchema" xmlns:p="http://schemas.microsoft.com/office/2006/metadata/properties" xmlns:ns3="b33a16b6-9e89-4ffa-be05-0158ba67738c" targetNamespace="http://schemas.microsoft.com/office/2006/metadata/properties" ma:root="true" ma:fieldsID="15e9c43bec60569f42c834a805a4c419" ns3:_="">
     <xsd:import namespace="b33a16b6-9e89-4ffa-be05-0158ba67738c"/>
@@ -2347,29 +2330,28 @@
 </ct:contentTypeSchema>
 </file>
 
+<file path=customXml/item2.xml><?xml version="1.0" encoding="utf-8"?>
+<p:properties xmlns:p="http://schemas.microsoft.com/office/2006/metadata/properties" xmlns:xsi="http://www.w3.org/2001/XMLSchema-instance" xmlns:pc="http://schemas.microsoft.com/office/infopath/2007/PartnerControls">
+  <documentManagement>
+    <_activity xmlns="b33a16b6-9e89-4ffa-be05-0158ba67738c" xsi:nil="true"/>
+  </documentManagement>
+</p:properties>
+</file>
+
+<file path=customXml/item3.xml><?xml version="1.0" encoding="utf-8"?>
+<?mso-contentType ?>
+<FormTemplates xmlns="http://schemas.microsoft.com/sharepoint/v3/contenttype/forms">
+  <Display>DocumentLibraryForm</Display>
+  <Edit>DocumentLibraryForm</Edit>
+  <New>DocumentLibraryForm</New>
+</FormTemplates>
+</file>
+
 <file path=customXml/item4.xml><?xml version="1.0" encoding="utf-8"?>
 <b:Sources xmlns:b="http://schemas.openxmlformats.org/officeDocument/2006/bibliography" xmlns="http://schemas.openxmlformats.org/officeDocument/2006/bibliography" SelectedStyle="\APASixthEditionOfficeOnline.xsl" StyleName="APA" Version="6"/>
 </file>
 
 <file path=customXml/itemProps1.xml><?xml version="1.0" encoding="utf-8"?>
-<ds:datastoreItem xmlns:ds="http://schemas.openxmlformats.org/officeDocument/2006/customXml" ds:itemID="{3C9986F7-9A13-46B2-B654-5885BD04D0D4}">
-  <ds:schemaRefs>
-    <ds:schemaRef ds:uri="http://schemas.microsoft.com/sharepoint/v3/contenttype/forms"/>
-  </ds:schemaRefs>
-</ds:datastoreItem>
-</file>
-
-<file path=customXml/itemProps2.xml><?xml version="1.0" encoding="utf-8"?>
-<ds:datastoreItem xmlns:ds="http://schemas.openxmlformats.org/officeDocument/2006/customXml" ds:itemID="{5AB89323-58B9-47A7-905A-D63C11A98999}">
-  <ds:schemaRefs>
-    <ds:schemaRef ds:uri="http://schemas.microsoft.com/office/2006/metadata/properties"/>
-    <ds:schemaRef ds:uri="http://schemas.microsoft.com/office/infopath/2007/PartnerControls"/>
-    <ds:schemaRef ds:uri="b33a16b6-9e89-4ffa-be05-0158ba67738c"/>
-  </ds:schemaRefs>
-</ds:datastoreItem>
-</file>
-
-<file path=customXml/itemProps3.xml><?xml version="1.0" encoding="utf-8"?>
 <ds:datastoreItem xmlns:ds="http://schemas.openxmlformats.org/officeDocument/2006/customXml" ds:itemID="{34362B57-8356-4F6C-99BC-0E3693CC618F}">
   <ds:schemaRefs>
     <ds:schemaRef ds:uri="http://schemas.microsoft.com/office/2006/metadata/contentType"/>
@@ -2387,8 +2369,26 @@
 </ds:datastoreItem>
 </file>
 
+<file path=customXml/itemProps2.xml><?xml version="1.0" encoding="utf-8"?>
+<ds:datastoreItem xmlns:ds="http://schemas.openxmlformats.org/officeDocument/2006/customXml" ds:itemID="{5AB89323-58B9-47A7-905A-D63C11A98999}">
+  <ds:schemaRefs>
+    <ds:schemaRef ds:uri="http://schemas.microsoft.com/office/2006/metadata/properties"/>
+    <ds:schemaRef ds:uri="http://schemas.microsoft.com/office/infopath/2007/PartnerControls"/>
+    <ds:schemaRef ds:uri="b33a16b6-9e89-4ffa-be05-0158ba67738c"/>
+  </ds:schemaRefs>
+</ds:datastoreItem>
+</file>
+
+<file path=customXml/itemProps3.xml><?xml version="1.0" encoding="utf-8"?>
+<ds:datastoreItem xmlns:ds="http://schemas.openxmlformats.org/officeDocument/2006/customXml" ds:itemID="{3C9986F7-9A13-46B2-B654-5885BD04D0D4}">
+  <ds:schemaRefs>
+    <ds:schemaRef ds:uri="http://schemas.microsoft.com/sharepoint/v3/contenttype/forms"/>
+  </ds:schemaRefs>
+</ds:datastoreItem>
+</file>
+
 <file path=customXml/itemProps4.xml><?xml version="1.0" encoding="utf-8"?>
-<ds:datastoreItem xmlns:ds="http://schemas.openxmlformats.org/officeDocument/2006/customXml" ds:itemID="{34E17F74-6C72-460D-86C3-C42CD24A5E55}">
+<ds:datastoreItem xmlns:ds="http://schemas.openxmlformats.org/officeDocument/2006/customXml" ds:itemID="{CAA4319C-33F6-48ED-872E-4D59EF450D2B}">
   <ds:schemaRefs>
     <ds:schemaRef ds:uri="http://schemas.openxmlformats.org/officeDocument/2006/bibliography"/>
   </ds:schemaRefs>

</xml_diff>